<commit_message>
Update deployment module documentation
Revised '11. Modul 11 - Deploy.docx' with updated content. Details of the changes are in the latest version of the document.
</commit_message>
<xml_diff>
--- a/11. Modul 11 - Deploy.docx
+++ b/11. Modul 11 - Deploy.docx
@@ -66,6 +66,16 @@
           <w:szCs w:val="28"/>
         </w:rPr>
         <w:t>Deploy</w:t>
+      </w:r>
+      <w:r>
+        <w:rPr>
+          <w:rFonts w:ascii="Calibri" w:hAnsi="Calibri" w:cs="Calibri"/>
+          <w:b/>
+          <w:bCs/>
+          <w:sz w:val="28"/>
+          <w:szCs w:val="28"/>
+        </w:rPr>
+        <w:t>ment</w:t>
       </w:r>
     </w:p>
     <w:p>

</xml_diff>